<commit_message>
entrega(prd): atualizacao de 09/10 como versao 1.0.2
ATUALIZACAO_PRD_v1.0.2.zip refeito com 47d3b3a (banco sem WAL) e c79232e
(nao roda da rede), raiz de rede correta. Versao mantida em 1.0.2 a pedido;
o zip 1.0.3 sai (substituido por este). Roteiro de 09/10 atualizado.

Co-Authored-By: Claude Opus 5.5 <noreply@anthropic.com>
</commit_message>
<xml_diff>
--- a/ENTREGA/ROTEIRO_AJUSTES_CVC_IAM_2026-10-09.docx
+++ b/ENTREGA/ROTEIRO_AJUSTES_CVC_IAM_2026-10-09.docx
@@ -18,7 +18,7 @@
           <w:color w:val="5A6478"/>
           <w:sz w:val="26"/>
         </w:rPr>
-        <w:t>Atualização 1.0.3 — erro “database disk image is malformed”</w:t>
+        <w:t>Atualização de 09/10 — banco corrompido e execução pela rede</w:t>
       </w:r>
     </w:p>
     <w:p>
@@ -71,7 +71,7 @@
           <w:color w:val="2C3340"/>
           <w:sz w:val="20"/>
         </w:rPr>
-        <w:t>A causa é o modo de gravação “WAL” do SQLite, que não é seguro em pasta de rede. A versão 1.0.3 deixa de usá-lo.</w:t>
+        <w:t>A causa é o modo de gravação “WAL” do SQLite, que não é seguro em pasta de rede. Esta atualização deixa de usá-lo.</w:t>
       </w:r>
     </w:p>
     <w:p>
@@ -82,7 +82,7 @@
         <w:rPr>
           <w:color w:val="1F2D5C"/>
         </w:rPr>
-        <w:t>2. O que muda na 1.0.3</w:t>
+        <w:t>2. O que muda nesta atualização</w:t>
       </w:r>
     </w:p>
     <w:p>
@@ -135,6 +135,18 @@
     </w:p>
     <w:p>
       <w:pPr>
+        <w:pStyle w:val="ListBullet"/>
+      </w:pPr>
+      <w:r>
+        <w:rPr>
+          <w:color w:val="2C3340"/>
+          <w:sz w:val="19"/>
+        </w:rPr>
+        <w:t>Painel e Processador não abrem mais direto da pasta de rede: mostram um aviso. Rodado da rede, o programa prende a pasta (ninguém consegue atualizar) e o painel passa a usar um único arquivo de cópia na rede para todos, o que corrompe o banco. Cada pessoa usa a sua cópia local de EXECUTAVEIS (ex.: C:\CVC_IAM\EXECUTAVEIS); os dados continuam na rede.</w:t>
+      </w:r>
+    </w:p>
+    <w:p>
+      <w:pPr>
         <w:pStyle w:val="Heading1"/>
       </w:pPr>
       <w:r>
@@ -153,7 +165,7 @@
           <w:color w:val="2C3340"/>
           <w:sz w:val="19"/>
         </w:rPr>
-        <w:t>Feche o painel e o Processador em todas as máquinas.</w:t>
+        <w:t>Feche o painel e o Processador em todas as máquinas. Quem abriu da rede: no Gerenciador de Tarefas, finalize launcher_visualizador.exe e launcher_processador.exe (o painel segue rodando após fechar o navegador). Sem saber quem abriu: renomeie os .exe da EXECUTAVEIS da rede (e da subpasta launcher) para .exe.old_0910 — um exe em uso pode ser renomeado, só não sobrescrito. Apague os .old_0910 depois.</w:t>
       </w:r>
     </w:p>
     <w:p>
@@ -189,7 +201,7 @@
           <w:color w:val="2C3340"/>
           <w:sz w:val="19"/>
         </w:rPr>
-        <w:t>Rode o Processador.exe uma vez, com todos os painéis fechados, e espere “Processamento finalizado”.</w:t>
+        <w:t>No seu computador, copie a EXECUTAVEIS da rede (já atualizada) por cima da sua cópia local (ex.: C:\CVC_IAM\EXECUTAVEIS) e abra o Processador.exe de lá. Uma máquina só, com todos os painéis fechados; espere “Processamento finalizado”.</w:t>
       </w:r>
     </w:p>
     <w:p>
@@ -201,7 +213,21 @@
           <w:color w:val="2C3340"/>
           <w:sz w:val="19"/>
         </w:rPr>
-        <w:t>Abra o painel.</w:t>
+        <w:t>Abra o painel (visualizador.exe da cópia local).</w:t>
+      </w:r>
+    </w:p>
+    <w:p>
+      <w:pPr>
+        <w:spacing w:after="80"/>
+      </w:pPr>
+      <w:r>
+        <w:rPr>
+          <w:b w:val="0"/>
+          <w:i w:val="0"/>
+          <w:color w:val="2C3340"/>
+          <w:sz w:val="19"/>
+        </w:rPr>
+        <w:t>Versão: o pacote vem como 1.0.2. As máquinas só se atualizam sozinhas quando a versão do config da rede muda. Enquanto ela ficar 1.0.2, quem usar o programa precisa copiar a EXECUTAVEIS nova para a máquina.</w:t>
       </w:r>
     </w:p>
     <w:p>
@@ -249,6 +275,18 @@
           <w:sz w:val="19"/>
         </w:rPr>
         <w:t>Com o Processador rodando, o botão Atualizar responde “Processamento em andamento na rede”; depois que ele termina, a carga nova aparece.</w:t>
+      </w:r>
+    </w:p>
+    <w:p>
+      <w:pPr>
+        <w:pStyle w:val="ListBullet"/>
+      </w:pPr>
+      <w:r>
+        <w:rPr>
+          <w:color w:val="2C3340"/>
+          <w:sz w:val="19"/>
+        </w:rPr>
+        <w:t>Abrir o visualizador.exe ou o Processador.exe direto da pasta de rede mostra o aviso “não pode ser aberto direto da pasta de rede” e não abre.</w:t>
       </w:r>
     </w:p>
     <w:p>

</xml_diff>